<commit_message>
Ship chrome, stories-home hero, and story filename cleanup.
Refresh footer/contact and wisdom hero assets, drop obsolete Kindle tooling, harden build prereqs, and normalize wisdom-story stems without leading a-/the-.

Co-authored-by: Cursor <cursoragent@cursor.com>
</commit_message>
<xml_diff>
--- a/az/wisdom-stories/architect-sinan-dies-in-a-house-without-water.docx
+++ b/az/wisdom-stories/architect-sinan-dies-in-a-house-without-water.docx
@@ -34,159 +34,101 @@
       </w:r>
     </w:p>
     <w:p>
-      <w:pPr>
-        <w:rPr>
-          <w:lang/>
-        </w:rPr>
-      </w:pPr>
       <w:r>
-        <w:rPr>
-          <w:lang/>
-        </w:rPr>
         <w:t>Sultanın hüzuruna qayıdanda dedi:</w:t>
       </w:r>
     </w:p>
     <w:p>
-      <w:pPr>
-        <w:rPr>
-          <w:lang/>
-        </w:rPr>
-      </w:pPr>
       <w:r>
-        <w:rPr>
-          <w:lang/>
-        </w:rPr>
         <w:t>— İstanbula su gətirmək mümkündür, ancaq bu iş çox böyük xərc tələb edəcək. Bunun üçün saysız-hesabsız qızıl kisəsi lazım olacaq.</w:t>
       </w:r>
     </w:p>
     <w:p>
-      <w:pPr>
-        <w:rPr>
-          <w:lang/>
-        </w:rPr>
-      </w:pPr>
       <w:r>
-        <w:rPr>
-          <w:lang/>
-        </w:rPr>
         <w:t>Sultan cavab verdi:</w:t>
       </w:r>
     </w:p>
     <w:p>
-      <w:pPr>
-        <w:rPr>
-          <w:lang/>
-        </w:rPr>
-      </w:pPr>
       <w:r>
-        <w:rPr>
-          <w:lang/>
-        </w:rPr>
         <w:t>— Sən yetər ki, bunun mümkün olduğunu söylə. Nə qədər qızıl tələb olunsa, verəcəyəm.</w:t>
       </w:r>
     </w:p>
     <w:p>
-      <w:pPr>
-        <w:rPr>
-          <w:lang/>
-        </w:rPr>
-      </w:pPr>
       <w:r>
-        <w:rPr>
-          <w:lang/>
-        </w:rPr>
         <w:t>Sinan işə başladı və şəhərin müxtəlif meydanlarına su çatdıran, qırx çeşmə ilə tamamlanan möhtəşəm sistemi qurdu. Suyun israf edilməməsi üçün çeşmələrə kranlar qoyuldu.</w:t>
       </w:r>
     </w:p>
     <w:p>
-      <w:pPr>
-        <w:rPr>
-          <w:lang/>
-        </w:rPr>
-      </w:pPr>
       <w:r>
-        <w:rPr>
-          <w:lang/>
-        </w:rPr>
         <w:t>Sultan ümumi çeşmələrin xalqa məxsus olduğunu bildirən və evlərə gizli su xətti çəkməyi qadağan edən fərman verdi. Lakin Sinanın xidmətini nəzərə alaraq ona evinə xüsusi su xətti çəkdirməyə şifahi icazə verdi.</w:t>
       </w:r>
     </w:p>
     <w:p>
-      <w:pPr>
-        <w:rPr>
-          <w:lang/>
-        </w:rPr>
-      </w:pPr>
       <w:r>
-        <w:rPr>
-          <w:lang/>
-        </w:rPr>
         <w:t>İllər keçdi. Sultan Süleyman və Sinanın xidmətini yaxından bilənlər dünyadan köçdülər. Yaşlı memar bir gün saraya çağırıldı. Divan üzvləri evində xüsusi su olmasına dair şikayəti araşdırırdılar.</w:t>
       </w:r>
     </w:p>
     <w:p>
-      <w:pPr>
-        <w:rPr>
-          <w:lang/>
-        </w:rPr>
-      </w:pPr>
       <w:r>
-        <w:rPr>
-          <w:lang/>
-        </w:rPr>
         <w:t>Sinan sultanın ona icazə verdiyini söylədi. Lakin yazılı fərman istənəndə etiraf etdi:</w:t>
       </w:r>
     </w:p>
     <w:p>
-      <w:pPr>
-        <w:rPr>
-          <w:lang/>
-        </w:rPr>
-      </w:pPr>
       <w:r>
-        <w:rPr>
-          <w:lang/>
-        </w:rPr>
         <w:t>— O vaxt Cahan Padşahından fərman almağa utanmışdım. Yazılı sənədim yoxdur.</w:t>
       </w:r>
     </w:p>
     <w:p>
-      <w:pPr>
-        <w:rPr>
-          <w:lang/>
-        </w:rPr>
-      </w:pPr>
       <w:r>
-        <w:rPr>
-          <w:lang/>
-        </w:rPr>
         <w:t>Uzun müzakirədən sonra divan onun əvvəlki istifadəsinə görə cəzalandırılmamasına, lakin xüsusi su xəttinin kəsilməsinə qərar verdi.</w:t>
       </w:r>
     </w:p>
     <w:p>
-      <w:pPr>
-        <w:rPr>
-          <w:lang/>
-        </w:rPr>
-      </w:pPr>
       <w:r>
-        <w:rPr>
-          <w:lang/>
-        </w:rPr>
         <w:t>Ömrünün sonlarında Sinan xəstələnib yatağa düşdü. Dodaqlarını islatmaq üçün su istəyəndə evdəki kranın axmadığını gördülər. Böyük memar dedi:</w:t>
       </w:r>
     </w:p>
     <w:p>
-      <w:pPr>
-        <w:rPr>
-          <w:lang/>
-        </w:rPr>
-      </w:pPr>
       <w:r>
-        <w:rPr>
-          <w:lang/>
-        </w:rPr>
-        <w:t>— Biz xidmətimizi mənfəət üçün deyil, Tanrı rizası üçün etdik. Mükafatını da axirətdə gözləyirik. Bu dünyada evimizə su verilmədiyinə görə kədərlənmirik.</w:t>
+        <w:t xml:space="preserve">— Biz xidmətimizi </w:t>
+      </w:r>
+      <w:proofErr w:type="spellStart"/>
+      <w:r>
+        <w:t>mənfəət</w:t>
+      </w:r>
+      <w:proofErr w:type="spellEnd"/>
+      <w:r>
+        <w:t xml:space="preserve"> üçün </w:t>
+      </w:r>
+      <w:proofErr w:type="spellStart"/>
+      <w:r>
+        <w:t>deyil</w:t>
+      </w:r>
+      <w:proofErr w:type="spellEnd"/>
+      <w:r>
+        <w:t xml:space="preserve">, </w:t>
+      </w:r>
+      <w:r>
+        <w:t>Allah</w:t>
+      </w:r>
+      <w:r>
+        <w:t xml:space="preserve"> </w:t>
+      </w:r>
+      <w:proofErr w:type="spellStart"/>
+      <w:r>
+        <w:t>rizası</w:t>
+      </w:r>
+      <w:proofErr w:type="spellEnd"/>
+      <w:r>
+        <w:t xml:space="preserve"> üçün </w:t>
+      </w:r>
+      <w:proofErr w:type="spellStart"/>
+      <w:r>
+        <w:t>etdik</w:t>
+      </w:r>
+      <w:proofErr w:type="spellEnd"/>
+      <w:r>
+        <w:t>. Mükafatını da axirətdə gözləyirik. Bu dünyada evimizə su verilmədiyinə görə kədərlənmirik.</w:t>
       </w:r>
     </w:p>
     <w:p>
@@ -203,9 +145,6 @@
         <w:shd w:val="clear" w:color="auto" w:fill="FFF8E1"/>
         <w:spacing w:before="240" w:after="180" w:line="283" w:lineRule="auto"/>
         <w:ind w:left="240" w:right="240"/>
-        <w:rPr>
-          <w:lang/>
-        </w:rPr>
       </w:pPr>
       <w:r>
         <w:rPr>
@@ -213,7 +152,6 @@
           <w:b/>
           <w:i w:val="0"/>
           <w:color w:val="9A7417"/>
-          <w:lang/>
         </w:rPr>
         <w:t xml:space="preserve">İbrət: </w:t>
       </w:r>
@@ -222,7 +160,6 @@
           <w:rFonts w:cs="Arial"/>
           <w:i w:val="0"/>
           <w:color w:val="3F3826"/>
-          <w:lang/>
         </w:rPr>
         <w:t>Dünyaya, şöhrətə və insanların vəfasına həddindən artıq bel bağlama. Əsl xidmət şəxsi mənfəət üçün deyil, haqq bildiyin dəyər uğrunda ediləndir.</w:t>
       </w:r>
@@ -246,7 +183,6 @@
           <w:i/>
           <w:color w:val="8A7950"/>
           <w:sz w:val="17"/>
-          <w:lang/>
         </w:rPr>
         <w:t>Hekayə açıq İnternet mənbələrindən əldə olunub.</w:t>
       </w:r>
@@ -1145,6 +1081,7 @@
   <w:style w:type="character" w:default="1" w:styleId="DefaultParagraphFont">
     <w:name w:val="Default Paragraph Font"/>
     <w:uiPriority w:val="1"/>
+    <w:semiHidden/>
     <w:unhideWhenUsed/>
   </w:style>
   <w:style w:type="table" w:default="1" w:styleId="TableNormal">

</xml_diff>